<commit_message>
Design Document, Product Backlog, Project plan Document, Sprint Backlog_Sprint 3 files are updated.
</commit_message>
<xml_diff>
--- a/PA Documents/Product Backlog.docx
+++ b/PA Documents/Product Backlog.docx
@@ -5841,22 +5841,9 @@
             </w:pPr>
             <w:r>
               <w:rPr>
-                <w:rFonts w:ascii="Arial" w:cs="Arial" w:eastAsia="Arial" w:hAnsi="Arial"/>
-                <w:b w:val="0"/>
-                <w:bCs w:val="0"/>
-                <w:i w:val="0"/>
-                <w:iCs w:val="0"/>
-                <w:smallCaps w:val="0"/>
-                <w:strike w:val="0"/>
-                <w:color w:val="000000"/>
-                <w:sz w:val="22"/>
-                <w:szCs w:val="22"/>
-                <w:u w:val="none"/>
-                <w:shd w:fill="auto" w:val="clear"/>
-                <w:vertAlign w:val="baseline"/>
-                <w:rtl w:val="0"/>
-              </w:rPr>
-              <w:t xml:space="preserve">Sırada</w:t>
+                <w:rtl w:val="0"/>
+              </w:rPr>
+              <w:t xml:space="preserve">Tamamlandı</w:t>
             </w:r>
             <w:r>
               <w:rPr>
@@ -6152,22 +6139,9 @@
             </w:pPr>
             <w:r>
               <w:rPr>
-                <w:rFonts w:ascii="Arial" w:cs="Arial" w:eastAsia="Arial" w:hAnsi="Arial"/>
-                <w:b w:val="0"/>
-                <w:bCs w:val="0"/>
-                <w:i w:val="0"/>
-                <w:iCs w:val="0"/>
-                <w:smallCaps w:val="0"/>
-                <w:strike w:val="0"/>
-                <w:color w:val="000000"/>
-                <w:sz w:val="22"/>
-                <w:szCs w:val="22"/>
-                <w:u w:val="none"/>
-                <w:shd w:fill="auto" w:val="clear"/>
-                <w:vertAlign w:val="baseline"/>
-                <w:rtl w:val="0"/>
-              </w:rPr>
-              <w:t xml:space="preserve">Sırada</w:t>
+                <w:rtl w:val="0"/>
+              </w:rPr>
+              <w:t xml:space="preserve">Tamamlandı</w:t>
             </w:r>
             <w:r>
               <w:rPr>
@@ -6501,22 +6475,9 @@
             </w:pPr>
             <w:r>
               <w:rPr>
-                <w:rFonts w:ascii="Arial" w:cs="Arial" w:eastAsia="Arial" w:hAnsi="Arial"/>
-                <w:b w:val="0"/>
-                <w:bCs w:val="0"/>
-                <w:i w:val="0"/>
-                <w:iCs w:val="0"/>
-                <w:smallCaps w:val="0"/>
-                <w:strike w:val="0"/>
-                <w:color w:val="000000"/>
-                <w:sz w:val="22"/>
-                <w:szCs w:val="22"/>
-                <w:u w:val="none"/>
-                <w:shd w:fill="auto" w:val="clear"/>
-                <w:vertAlign w:val="baseline"/>
-                <w:rtl w:val="0"/>
-              </w:rPr>
-              <w:t xml:space="preserve">Sırada</w:t>
+                <w:rtl w:val="0"/>
+              </w:rPr>
+              <w:t xml:space="preserve">Tamamlandı</w:t>
             </w:r>
             <w:r>
               <w:rPr>
@@ -7123,22 +7084,9 @@
             </w:pPr>
             <w:r>
               <w:rPr>
-                <w:rFonts w:ascii="Arial" w:cs="Arial" w:eastAsia="Arial" w:hAnsi="Arial"/>
-                <w:b w:val="0"/>
-                <w:bCs w:val="0"/>
-                <w:i w:val="0"/>
-                <w:iCs w:val="0"/>
-                <w:smallCaps w:val="0"/>
-                <w:strike w:val="0"/>
-                <w:color w:val="000000"/>
-                <w:sz w:val="22"/>
-                <w:szCs w:val="22"/>
-                <w:u w:val="none"/>
-                <w:shd w:fill="auto" w:val="clear"/>
-                <w:vertAlign w:val="baseline"/>
-                <w:rtl w:val="0"/>
-              </w:rPr>
-              <w:t xml:space="preserve">Sırada</w:t>
+                <w:rtl w:val="0"/>
+              </w:rPr>
+              <w:t xml:space="preserve">Tamamlandı</w:t>
             </w:r>
             <w:r>
               <w:rPr>

</xml_diff>